<commit_message>
Poster figures: CR breakdown, encode/decode timing and per-core resources; firmware records the decoder latency
make_poster_figs: Stage 1 shaded region renamed "selected"; Stage 2 shows the
CR from the Huffman coder alone plus the extra from prediction (DRHE 3.48 +
0.27 = 3.75, LPC 3.48 + 0.22 = 3.70, Kiem's dictionary); fig_latency replaced
by fig_timing (linear time per frame, encode and decode rows, LPC split into
store / solve / emit); fig_resources shows encoder, decoder and both from the
hierarchical reports of the *_full builds (new: vivado/hier_util_full.tcl).

Firmware 1.1: result records are 16 words; word 9 is the decoder latency
(last compressed word read -> last output written on dma_d). run_board.tcl
and compare_results.py follow (rec_words in run_info; old 8-word runs still
read). All four ELFs rebuilt.

Co-Authored-By: Claude Opus 5.5 <noreply@anthropic.com>
Claude-Session: https://claude.ai/code/session_01PTFeJVKomSrXvcoBdZ7d4L
</commit_message>
<xml_diff>
--- a/ThesisA/poster/Thesis_Poster_Draft_A3.docx
+++ b/ThesisA/poster/Thesis_Poster_Draft_A3.docx
@@ -3375,7 +3375,7 @@
             <w:r>
               <w:drawing>
                 <wp:inline distT="0" distB="0" distL="0" distR="0">
-                  <wp:extent cx="3067050" cy="2219325"/>
+                  <wp:extent cx="3067050" cy="2181225"/>
                   <wp:effectExtent t="0" r="0" b="0" l="0"/>
                   <wp:docPr id="1" name="" descr="" title=""/>
                   <wp:cNvGraphicFramePr>
@@ -3400,7 +3400,7 @@
                         <pic:spPr bwMode="auto">
                           <a:xfrm>
                             <a:off x="0" y="0"/>
-                            <a:ext cx="3067050" cy="2219325"/>
+                            <a:ext cx="3067050" cy="2181225"/>
                           </a:xfrm>
                           <a:prstGeom prst="rect">
                             <a:avLst/>
@@ -3427,7 +3427,7 @@
                 <w:sz w:val="18"/>
                 <w:szCs w:val="18"/>
               </w:rPr>
-              <w:t xml:space="preserve">Figure 3: Mean CR over 50 frames, two Huffman dictionaries</w:t>
+              <w:t xml:space="preserve">Figure 3: CR from the Huffman coder alone, plus prediction (50 frames)</w:t>
             </w:r>
           </w:p>
           <w:p>
@@ -4290,7 +4290,7 @@
                       <w:sz w:val="18"/>
                       <w:szCs w:val="18"/>
                     </w:rPr>
-                    <w:t xml:space="preserve">Latency (µs)</w:t>
+                    <w:t xml:space="preserve">Encode latency (µs)</w:t>
                   </w:r>
                 </w:p>
               </w:tc>
@@ -4696,7 +4696,7 @@
             <w:r>
               <w:drawing>
                 <wp:inline distT="0" distB="0" distL="0" distR="0">
-                  <wp:extent cx="2819400" cy="2038350"/>
+                  <wp:extent cx="3067050" cy="2209800"/>
                   <wp:effectExtent t="0" r="0" b="0" l="0"/>
                   <wp:docPr id="1" name="" descr="" title=""/>
                   <wp:cNvGraphicFramePr>
@@ -4721,7 +4721,7 @@
                         <pic:spPr bwMode="auto">
                           <a:xfrm>
                             <a:off x="0" y="0"/>
-                            <a:ext cx="2819400" cy="2038350"/>
+                            <a:ext cx="3067050" cy="2209800"/>
                           </a:xfrm>
                           <a:prstGeom prst="rect">
                             <a:avLst/>
@@ -4748,7 +4748,7 @@
                 <w:sz w:val="18"/>
                 <w:szCs w:val="18"/>
               </w:rPr>
-              <w:t xml:space="preserve">Figure 7: Latency, last input → last output</w:t>
+              <w:t xml:space="preserve">Figure 7: Encode and decode time per frame (decode: board run pending)</w:t>
             </w:r>
           </w:p>
         </w:tc>
@@ -4795,7 +4795,7 @@
             <w:r>
               <w:drawing>
                 <wp:inline distT="0" distB="0" distL="0" distR="0">
-                  <wp:extent cx="3067050" cy="2266950"/>
+                  <wp:extent cx="3067050" cy="2114550"/>
                   <wp:effectExtent t="0" r="0" b="0" l="0"/>
                   <wp:docPr id="1" name="" descr="" title=""/>
                   <wp:cNvGraphicFramePr>
@@ -4820,7 +4820,7 @@
                         <pic:spPr bwMode="auto">
                           <a:xfrm>
                             <a:off x="0" y="0"/>
-                            <a:ext cx="3067050" cy="2266950"/>
+                            <a:ext cx="3067050" cy="2114550"/>
                           </a:xfrm>
                           <a:prstGeom prst="rect">
                             <a:avLst/>
@@ -4847,7 +4847,7 @@
                 <w:sz w:val="18"/>
                 <w:szCs w:val="18"/>
               </w:rPr>
-              <w:t xml:space="preserve">Figure 8: Compressor only vs with on-chip decompressor</w:t>
+              <w:t xml:space="preserve">Figure 8: Encoder, decoder and both (cores only)</w:t>
             </w:r>
           </w:p>
           <w:tbl>
@@ -5016,7 +5016,7 @@
                       <w:sz w:val="18"/>
                       <w:szCs w:val="18"/>
                     </w:rPr>
-                    <w:t xml:space="preserve">DRHE latency</w:t>
+                    <w:t xml:space="preserve">DRHE encode latency</w:t>
                   </w:r>
                 </w:p>
               </w:tc>
@@ -5051,7 +5051,7 @@
                       <w:sz w:val="52"/>
                       <w:szCs w:val="52"/>
                     </w:rPr>
-                    <w:t xml:space="preserve">38 %</w:t>
+                    <w:t xml:space="preserve">23 %</w:t>
                   </w:r>
                 </w:p>
                 <w:p>
@@ -5066,7 +5066,7 @@
                       <w:sz w:val="18"/>
                       <w:szCs w:val="18"/>
                     </w:rPr>
-                    <w:t xml:space="preserve">chip, DRHE comp + decomp</w:t>
+                    <w:t xml:space="preserve">of LUTs, DRHE enc + dec</w:t>
                   </w:r>
                 </w:p>
               </w:tc>

</xml_diff>

<commit_message>
Poster figures: CR breakdown includes the new dictionary; simpler timing and per-frame plots
Stage 2 waterfall: Huffman coder 3.48, + prediction, + re-derived dictionary,
total (DRHE 3.48 + 0.27 + 0.47 = 4.22; LPC 3.48 + 0.22 + 0.71 = 4.40).
Per-frame CR starts at 0 and has no training band; Stage 1 has no legend;
the LPC timing bar is one bar with the latency bracket.

Co-Authored-By: Claude Opus 5.5 <noreply@anthropic.com>
Claude-Session: https://claude.ai/code/session_01PTFeJVKomSrXvcoBdZ7d4L
</commit_message>
<xml_diff>
--- a/ThesisA/poster/Thesis_Poster_Draft_A3.docx
+++ b/ThesisA/poster/Thesis_Poster_Draft_A3.docx
@@ -3375,7 +3375,7 @@
             <w:r>
               <w:drawing>
                 <wp:inline distT="0" distB="0" distL="0" distR="0">
-                  <wp:extent cx="3067050" cy="2181225"/>
+                  <wp:extent cx="3067050" cy="2286000"/>
                   <wp:effectExtent t="0" r="0" b="0" l="0"/>
                   <wp:docPr id="1" name="" descr="" title=""/>
                   <wp:cNvGraphicFramePr>
@@ -3400,7 +3400,7 @@
                         <pic:spPr bwMode="auto">
                           <a:xfrm>
                             <a:off x="0" y="0"/>
-                            <a:ext cx="3067050" cy="2181225"/>
+                            <a:ext cx="3067050" cy="2286000"/>
                           </a:xfrm>
                           <a:prstGeom prst="rect">
                             <a:avLst/>
@@ -3427,7 +3427,7 @@
                 <w:sz w:val="18"/>
                 <w:szCs w:val="18"/>
               </w:rPr>
-              <w:t xml:space="preserve">Figure 3: CR from the Huffman coder alone, plus prediction (50 frames)</w:t>
+              <w:t xml:space="preserve">Figure 3: CR built up from Huffman coding, prediction and the new dictionary (50 frames)</w:t>
             </w:r>
           </w:p>
           <w:p>
@@ -3438,7 +3438,7 @@
             <w:r>
               <w:drawing>
                 <wp:inline distT="0" distB="0" distL="0" distR="0">
-                  <wp:extent cx="3067050" cy="1809750"/>
+                  <wp:extent cx="3067050" cy="1866900"/>
                   <wp:effectExtent t="0" r="0" b="0" l="0"/>
                   <wp:docPr id="1" name="" descr="" title=""/>
                   <wp:cNvGraphicFramePr>
@@ -3463,7 +3463,7 @@
                         <pic:spPr bwMode="auto">
                           <a:xfrm>
                             <a:off x="0" y="0"/>
-                            <a:ext cx="3067050" cy="1809750"/>
+                            <a:ext cx="3067050" cy="1866900"/>
                           </a:xfrm>
                           <a:prstGeom prst="rect">
                             <a:avLst/>
@@ -4696,7 +4696,7 @@
             <w:r>
               <w:drawing>
                 <wp:inline distT="0" distB="0" distL="0" distR="0">
-                  <wp:extent cx="3067050" cy="2209800"/>
+                  <wp:extent cx="3067050" cy="2228850"/>
                   <wp:effectExtent t="0" r="0" b="0" l="0"/>
                   <wp:docPr id="1" name="" descr="" title=""/>
                   <wp:cNvGraphicFramePr>
@@ -4721,7 +4721,7 @@
                         <pic:spPr bwMode="auto">
                           <a:xfrm>
                             <a:off x="0" y="0"/>
-                            <a:ext cx="3067050" cy="2209800"/>
+                            <a:ext cx="3067050" cy="2228850"/>
                           </a:xfrm>
                           <a:prstGeom prst="rect">
                             <a:avLst/>

</xml_diff>